<commit_message>
Add pre-trade BBAS checker, 12M ADV trough stress and VaR proxy to universe deliverables
Co-Authored-By: Claude Fable 5.1 <noreply@anthropic.com>
Claude-Session: https://claude.ai/code/session_01PX2wqYPfPC8mPXdaesMFSk
</commit_message>
<xml_diff>
--- a/output/Korea_Universe_BBAS_Memo_2026-09-03.docx
+++ b/output/Korea_Universe_BBAS_Memo_2026-09-03.docx
@@ -117,6 +117,62 @@
           <w:rFonts w:ascii="Arial" w:hAnsi="Arial" w:eastAsia="Malgun Gothic" w:cs="Arial"/>
         </w:rPr>
         <w:t xml:space="preserve">500억 Book 기준 6% 풀사이즈(30억)를 3거래일 내 청산 가능한 종목 329개, 1,000억 Book(60억)은 242개. Stress(ADV -50%) 시 242개.</w:t>
+      </w:r>
+    </w:p>
+    <w:p>
+      <w:pPr>
+        <w:pStyle w:val="ListParagraph"/>
+        <w:numPr>
+          <w:ilvl w:val="0"/>
+          <w:numId w:val="2"/>
+        </w:numPr>
+        <w:spacing w:after="40"/>
+      </w:pPr>
+      <w:r>
+        <w:rPr>
+          <w:b/>
+          <w:bCs/>
+          <w:sz w:val="19"/>
+          <w:szCs w:val="19"/>
+          <w:rFonts w:ascii="Arial" w:hAnsi="Arial" w:eastAsia="Malgun Gothic" w:cs="Arial"/>
+        </w:rPr>
+        <w:t xml:space="preserve">Stress 실증: </w:t>
+      </w:r>
+      <w:r>
+        <w:rPr>
+          <w:sz w:val="19"/>
+          <w:szCs w:val="19"/>
+          <w:rFonts w:ascii="Arial" w:hAnsi="Arial" w:eastAsia="Malgun Gothic" w:cs="Arial"/>
+        </w:rPr>
+        <w:t xml:space="preserve">12개월 rolling-20D ADV 저점 / 현재 ADV 비율 중위 0.50x (유니버스의 49%가 0.5x 미만). 저점 ADV 기준 6% 풀사이즈 3일 청산 가능 종목은 500억 Book 209개, 1,000억 Book 141개로 축소. 50% haircut 가정은 보수적이 아니라 base case.</w:t>
+      </w:r>
+    </w:p>
+    <w:p>
+      <w:pPr>
+        <w:pStyle w:val="ListParagraph"/>
+        <w:numPr>
+          <w:ilvl w:val="0"/>
+          <w:numId w:val="2"/>
+        </w:numPr>
+        <w:spacing w:after="40"/>
+      </w:pPr>
+      <w:r>
+        <w:rPr>
+          <w:b/>
+          <w:bCs/>
+          <w:sz w:val="19"/>
+          <w:szCs w:val="19"/>
+          <w:rFonts w:ascii="Arial" w:hAnsi="Arial" w:eastAsia="Malgun Gothic" w:cs="Arial"/>
+        </w:rPr>
+        <w:t xml:space="preserve">VaR가 먼저 binding: </w:t>
+      </w:r>
+      <w:r>
+        <w:rPr>
+          <w:sz w:val="19"/>
+          <w:szCs w:val="19"/>
+          <w:rFonts w:ascii="Arial" w:hAnsi="Arial" w:eastAsia="Malgun Gothic" w:cs="Arial"/>
+        </w:rPr>
+        <w:t xml:space="preserve">유니버스 60D 변동성 중위 85% (250D 75%) → 종목별 1D 99% VaR proxy 중위 12.5%. 샘플 포트(Gross 60%, pair 중심)의 VaR proxy는 zero-corr 기준 2.2%로 -1% 한도의 2배 이상. 현 regime에서는 편입비 6%보다 VaR -1%가 Gross를 결정.</w:t>
       </w:r>
     </w:p>
     <w:p>
@@ -33546,7 +33602,726 @@
           <w:szCs w:val="19"/>
           <w:rFonts w:ascii="Arial" w:hAnsi="Arial" w:eastAsia="Malgun Gothic" w:cs="Arial"/>
         </w:rPr>
-        <w:t xml:space="preserve">A1 60D 변동성 중위 87.5%, B 94.1% — 개별주 vol 80-95%는 1D 99% VaR -1% 룰 하에서 6% 포지션 자체가 VaR 예산(대략 1D 1σ 5-6% × 6% ≈ 0.3-0.4%p)의 1/3을 소비. 룰상 사이징보다 VaR 사이징이 먼저 binding.</w:t>
+        <w:t xml:space="preserve">A1 60D 변동성 중위 87.5%, B 94.1% — 개별주 vol 80-95%는 1D 99% VaR 기준 종목당 12-13%. 6% 포지션 하나가 VaR 예산(-1%)의 0.7-0.8%p를 소비 → 룰상 편입비보다 VaR 사이징이 먼저 binding (5-2 참조).</w:t>
+      </w:r>
+    </w:p>
+    <w:p>
+      <w:pPr>
+        <w:pStyle w:val="Heading2"/>
+        <w:spacing w:before="160" w:after="60"/>
+      </w:pPr>
+      <w:r>
+        <w:rPr>
+          <w:b/>
+          <w:bCs/>
+          <w:color w:val="1F3864"/>
+          <w:sz w:val="21"/>
+          <w:szCs w:val="21"/>
+          <w:rFonts w:ascii="Arial" w:hAnsi="Arial" w:eastAsia="Malgun Gothic" w:cs="Arial"/>
+        </w:rPr>
+        <w:t xml:space="preserve">5-1. 유동성 Stress 실증 (12개월 ADV 저점)</w:t>
+      </w:r>
+    </w:p>
+    <w:tbl>
+      <w:tblPr>
+        <w:tblW w:type="dxa" w:w="9000"/>
+        <w:tblBorders>
+          <w:top w:val="single" w:color="auto" w:sz="4"/>
+          <w:left w:val="single" w:color="auto" w:sz="4"/>
+          <w:bottom w:val="single" w:color="auto" w:sz="4"/>
+          <w:right w:val="single" w:color="auto" w:sz="4"/>
+          <w:insideH w:val="single" w:color="auto" w:sz="4"/>
+          <w:insideV w:val="single" w:color="auto" w:sz="4"/>
+        </w:tblBorders>
+      </w:tblPr>
+      <w:tblGrid>
+        <w:gridCol w:w="2400"/>
+        <w:gridCol w:w="2000"/>
+        <w:gridCol w:w="4600"/>
+      </w:tblGrid>
+      <w:tr>
+        <w:trPr>
+          <w:tblHeader/>
+        </w:trPr>
+        <w:tc>
+          <w:tcPr>
+            <w:tcW w:type="dxa" w:w="2400"/>
+            <w:tcBorders>
+              <w:top w:val="single" w:color="BFBFBF" w:sz="4"/>
+              <w:left w:val="single" w:color="BFBFBF" w:sz="4"/>
+              <w:bottom w:val="single" w:color="BFBFBF" w:sz="4"/>
+              <w:right w:val="single" w:color="BFBFBF" w:sz="4"/>
+            </w:tcBorders>
+            <w:shd w:fill="1F3864" w:color="auto" w:val="clear"/>
+            <w:tcMar>
+              <w:top w:type="dxa" w:w="30"/>
+              <w:left w:type="dxa" w:w="60"/>
+              <w:bottom w:type="dxa" w:w="30"/>
+              <w:right w:type="dxa" w:w="60"/>
+            </w:tcMar>
+          </w:tcPr>
+          <w:p>
+            <w:pPr>
+              <w:spacing w:after="0"/>
+              <w:jc w:val="center"/>
+            </w:pPr>
+            <w:r>
+              <w:rPr>
+                <w:b/>
+                <w:bCs/>
+                <w:color w:val="FFFFFF"/>
+                <w:sz w:val="14"/>
+                <w:szCs w:val="14"/>
+                <w:rFonts w:ascii="Arial" w:hAnsi="Arial" w:eastAsia="Malgun Gothic" w:cs="Arial"/>
+              </w:rPr>
+              <w:t xml:space="preserve">Tier</w:t>
+            </w:r>
+          </w:p>
+        </w:tc>
+        <w:tc>
+          <w:tcPr>
+            <w:tcW w:type="dxa" w:w="2000"/>
+            <w:tcBorders>
+              <w:top w:val="single" w:color="BFBFBF" w:sz="4"/>
+              <w:left w:val="single" w:color="BFBFBF" w:sz="4"/>
+              <w:bottom w:val="single" w:color="BFBFBF" w:sz="4"/>
+              <w:right w:val="single" w:color="BFBFBF" w:sz="4"/>
+            </w:tcBorders>
+            <w:shd w:fill="1F3864" w:color="auto" w:val="clear"/>
+            <w:tcMar>
+              <w:top w:type="dxa" w:w="30"/>
+              <w:left w:type="dxa" w:w="60"/>
+              <w:bottom w:type="dxa" w:w="30"/>
+              <w:right w:type="dxa" w:w="60"/>
+            </w:tcMar>
+          </w:tcPr>
+          <w:p>
+            <w:pPr>
+              <w:spacing w:after="0"/>
+              <w:jc w:val="center"/>
+            </w:pPr>
+            <w:r>
+              <w:rPr>
+                <w:b/>
+                <w:bCs/>
+                <w:color w:val="FFFFFF"/>
+                <w:sz w:val="14"/>
+                <w:szCs w:val="14"/>
+                <w:rFonts w:ascii="Arial" w:hAnsi="Arial" w:eastAsia="Malgun Gothic" w:cs="Arial"/>
+              </w:rPr>
+              <w:t xml:space="preserve">ADV 저점/현재 (중위)</w:t>
+            </w:r>
+          </w:p>
+        </w:tc>
+        <w:tc>
+          <w:tcPr>
+            <w:tcW w:type="dxa" w:w="4600"/>
+            <w:tcBorders>
+              <w:top w:val="single" w:color="BFBFBF" w:sz="4"/>
+              <w:left w:val="single" w:color="BFBFBF" w:sz="4"/>
+              <w:bottom w:val="single" w:color="BFBFBF" w:sz="4"/>
+              <w:right w:val="single" w:color="BFBFBF" w:sz="4"/>
+            </w:tcBorders>
+            <w:shd w:fill="1F3864" w:color="auto" w:val="clear"/>
+            <w:tcMar>
+              <w:top w:type="dxa" w:w="30"/>
+              <w:left w:type="dxa" w:w="60"/>
+              <w:bottom w:type="dxa" w:w="30"/>
+              <w:right w:type="dxa" w:w="60"/>
+            </w:tcMar>
+          </w:tcPr>
+          <w:p>
+            <w:pPr>
+              <w:spacing w:after="0"/>
+              <w:jc w:val="center"/>
+            </w:pPr>
+            <w:r>
+              <w:rPr>
+                <w:b/>
+                <w:bCs/>
+                <w:color w:val="FFFFFF"/>
+                <w:sz w:val="14"/>
+                <w:szCs w:val="14"/>
+                <w:rFonts w:ascii="Arial" w:hAnsi="Arial" w:eastAsia="Malgun Gothic" w:cs="Arial"/>
+              </w:rPr>
+              <w:t xml:space="preserve">해석</w:t>
+            </w:r>
+          </w:p>
+        </w:tc>
+      </w:tr>
+      <w:tr>
+        <w:tc>
+          <w:tcPr>
+            <w:tcW w:type="dxa" w:w="2400"/>
+            <w:tcBorders>
+              <w:top w:val="single" w:color="BFBFBF" w:sz="4"/>
+              <w:left w:val="single" w:color="BFBFBF" w:sz="4"/>
+              <w:bottom w:val="single" w:color="BFBFBF" w:sz="4"/>
+              <w:right w:val="single" w:color="BFBFBF" w:sz="4"/>
+            </w:tcBorders>
+            <w:tcMar>
+              <w:top w:type="dxa" w:w="30"/>
+              <w:left w:type="dxa" w:w="60"/>
+              <w:bottom w:type="dxa" w:w="30"/>
+              <w:right w:type="dxa" w:w="60"/>
+            </w:tcMar>
+          </w:tcPr>
+          <w:p>
+            <w:pPr>
+              <w:spacing w:after="0"/>
+            </w:pPr>
+            <w:r>
+              <w:rPr>
+                <w:b w:val="false"/>
+                <w:bCs w:val="false"/>
+                <w:sz w:val="14"/>
+                <w:szCs w:val="14"/>
+                <w:rFonts w:ascii="Arial" w:hAnsi="Arial" w:eastAsia="Malgun Gothic" w:cs="Arial"/>
+              </w:rPr>
+              <w:t xml:space="preserve">A1 Core Liquid</w:t>
+            </w:r>
+          </w:p>
+        </w:tc>
+        <w:tc>
+          <w:tcPr>
+            <w:tcW w:type="dxa" w:w="2000"/>
+            <w:tcBorders>
+              <w:top w:val="single" w:color="BFBFBF" w:sz="4"/>
+              <w:left w:val="single" w:color="BFBFBF" w:sz="4"/>
+              <w:bottom w:val="single" w:color="BFBFBF" w:sz="4"/>
+              <w:right w:val="single" w:color="BFBFBF" w:sz="4"/>
+            </w:tcBorders>
+            <w:tcMar>
+              <w:top w:type="dxa" w:w="30"/>
+              <w:left w:type="dxa" w:w="60"/>
+              <w:bottom w:type="dxa" w:w="30"/>
+              <w:right w:type="dxa" w:w="60"/>
+            </w:tcMar>
+          </w:tcPr>
+          <w:p>
+            <w:pPr>
+              <w:spacing w:after="0"/>
+            </w:pPr>
+            <w:r>
+              <w:rPr>
+                <w:b w:val="false"/>
+                <w:bCs w:val="false"/>
+                <w:sz w:val="14"/>
+                <w:szCs w:val="14"/>
+                <w:rFonts w:ascii="Arial" w:hAnsi="Arial" w:eastAsia="Malgun Gothic" w:cs="Arial"/>
+              </w:rPr>
+              <w:t xml:space="preserve">0.46x</w:t>
+            </w:r>
+          </w:p>
+        </w:tc>
+        <w:tc>
+          <w:tcPr>
+            <w:tcW w:type="dxa" w:w="4600"/>
+            <w:tcBorders>
+              <w:top w:val="single" w:color="BFBFBF" w:sz="4"/>
+              <w:left w:val="single" w:color="BFBFBF" w:sz="4"/>
+              <w:bottom w:val="single" w:color="BFBFBF" w:sz="4"/>
+              <w:right w:val="single" w:color="BFBFBF" w:sz="4"/>
+            </w:tcBorders>
+            <w:tcMar>
+              <w:top w:type="dxa" w:w="30"/>
+              <w:left w:type="dxa" w:w="60"/>
+              <w:bottom w:type="dxa" w:w="30"/>
+              <w:right w:type="dxa" w:w="60"/>
+            </w:tcMar>
+          </w:tcPr>
+          <w:p>
+            <w:pPr>
+              <w:spacing w:after="0"/>
+            </w:pPr>
+            <w:r>
+              <w:rPr>
+                <w:b w:val="false"/>
+                <w:bCs w:val="false"/>
+                <w:sz w:val="14"/>
+                <w:szCs w:val="14"/>
+                <w:rFonts w:ascii="Arial" w:hAnsi="Arial" w:eastAsia="Malgun Gothic" w:cs="Arial"/>
+              </w:rPr>
+              <w:t xml:space="preserve">급등락 국면 거래대금 팽창 → 정상화 시 절반</w:t>
+            </w:r>
+          </w:p>
+        </w:tc>
+      </w:tr>
+      <w:tr>
+        <w:tc>
+          <w:tcPr>
+            <w:tcW w:type="dxa" w:w="2400"/>
+            <w:tcBorders>
+              <w:top w:val="single" w:color="BFBFBF" w:sz="4"/>
+              <w:left w:val="single" w:color="BFBFBF" w:sz="4"/>
+              <w:bottom w:val="single" w:color="BFBFBF" w:sz="4"/>
+              <w:right w:val="single" w:color="BFBFBF" w:sz="4"/>
+            </w:tcBorders>
+            <w:tcMar>
+              <w:top w:type="dxa" w:w="30"/>
+              <w:left w:type="dxa" w:w="60"/>
+              <w:bottom w:type="dxa" w:w="30"/>
+              <w:right w:type="dxa" w:w="60"/>
+            </w:tcMar>
+          </w:tcPr>
+          <w:p>
+            <w:pPr>
+              <w:spacing w:after="0"/>
+            </w:pPr>
+            <w:r>
+              <w:rPr>
+                <w:b w:val="false"/>
+                <w:bCs w:val="false"/>
+                <w:sz w:val="14"/>
+                <w:szCs w:val="14"/>
+                <w:rFonts w:ascii="Arial" w:hAnsi="Arial" w:eastAsia="Malgun Gothic" w:cs="Arial"/>
+              </w:rPr>
+              <w:t xml:space="preserve">A2 Core Liquid (500억)</w:t>
+            </w:r>
+          </w:p>
+        </w:tc>
+        <w:tc>
+          <w:tcPr>
+            <w:tcW w:type="dxa" w:w="2000"/>
+            <w:tcBorders>
+              <w:top w:val="single" w:color="BFBFBF" w:sz="4"/>
+              <w:left w:val="single" w:color="BFBFBF" w:sz="4"/>
+              <w:bottom w:val="single" w:color="BFBFBF" w:sz="4"/>
+              <w:right w:val="single" w:color="BFBFBF" w:sz="4"/>
+            </w:tcBorders>
+            <w:tcMar>
+              <w:top w:type="dxa" w:w="30"/>
+              <w:left w:type="dxa" w:w="60"/>
+              <w:bottom w:type="dxa" w:w="30"/>
+              <w:right w:type="dxa" w:w="60"/>
+            </w:tcMar>
+          </w:tcPr>
+          <w:p>
+            <w:pPr>
+              <w:spacing w:after="0"/>
+            </w:pPr>
+            <w:r>
+              <w:rPr>
+                <w:b w:val="false"/>
+                <w:bCs w:val="false"/>
+                <w:sz w:val="14"/>
+                <w:szCs w:val="14"/>
+                <w:rFonts w:ascii="Arial" w:hAnsi="Arial" w:eastAsia="Malgun Gothic" w:cs="Arial"/>
+              </w:rPr>
+              <w:t xml:space="preserve">0.65x</w:t>
+            </w:r>
+          </w:p>
+        </w:tc>
+        <w:tc>
+          <w:tcPr>
+            <w:tcW w:type="dxa" w:w="4600"/>
+            <w:tcBorders>
+              <w:top w:val="single" w:color="BFBFBF" w:sz="4"/>
+              <w:left w:val="single" w:color="BFBFBF" w:sz="4"/>
+              <w:bottom w:val="single" w:color="BFBFBF" w:sz="4"/>
+              <w:right w:val="single" w:color="BFBFBF" w:sz="4"/>
+            </w:tcBorders>
+            <w:tcMar>
+              <w:top w:type="dxa" w:w="30"/>
+              <w:left w:type="dxa" w:w="60"/>
+              <w:bottom w:type="dxa" w:w="30"/>
+              <w:right w:type="dxa" w:w="60"/>
+            </w:tcMar>
+          </w:tcPr>
+          <w:p>
+            <w:pPr>
+              <w:spacing w:after="0"/>
+            </w:pPr>
+            <w:r>
+              <w:rPr>
+                <w:b w:val="false"/>
+                <w:bCs w:val="false"/>
+                <w:sz w:val="14"/>
+                <w:szCs w:val="14"/>
+                <w:rFonts w:ascii="Arial" w:hAnsi="Arial" w:eastAsia="Malgun Gothic" w:cs="Arial"/>
+              </w:rPr>
+              <w:t xml:space="preserve">상대적으로 안정</w:t>
+            </w:r>
+          </w:p>
+        </w:tc>
+      </w:tr>
+      <w:tr>
+        <w:tc>
+          <w:tcPr>
+            <w:tcW w:type="dxa" w:w="2400"/>
+            <w:tcBorders>
+              <w:top w:val="single" w:color="BFBFBF" w:sz="4"/>
+              <w:left w:val="single" w:color="BFBFBF" w:sz="4"/>
+              <w:bottom w:val="single" w:color="BFBFBF" w:sz="4"/>
+              <w:right w:val="single" w:color="BFBFBF" w:sz="4"/>
+            </w:tcBorders>
+            <w:tcMar>
+              <w:top w:type="dxa" w:w="30"/>
+              <w:left w:type="dxa" w:w="60"/>
+              <w:bottom w:type="dxa" w:w="30"/>
+              <w:right w:type="dxa" w:w="60"/>
+            </w:tcMar>
+          </w:tcPr>
+          <w:p>
+            <w:pPr>
+              <w:spacing w:after="0"/>
+            </w:pPr>
+            <w:r>
+              <w:rPr>
+                <w:b w:val="false"/>
+                <w:bCs w:val="false"/>
+                <w:sz w:val="14"/>
+                <w:szCs w:val="14"/>
+                <w:rFonts w:ascii="Arial" w:hAnsi="Arial" w:eastAsia="Malgun Gothic" w:cs="Arial"/>
+              </w:rPr>
+              <w:t xml:space="preserve">A3 Large-cap Illiquid</w:t>
+            </w:r>
+          </w:p>
+        </w:tc>
+        <w:tc>
+          <w:tcPr>
+            <w:tcW w:type="dxa" w:w="2000"/>
+            <w:tcBorders>
+              <w:top w:val="single" w:color="BFBFBF" w:sz="4"/>
+              <w:left w:val="single" w:color="BFBFBF" w:sz="4"/>
+              <w:bottom w:val="single" w:color="BFBFBF" w:sz="4"/>
+              <w:right w:val="single" w:color="BFBFBF" w:sz="4"/>
+            </w:tcBorders>
+            <w:tcMar>
+              <w:top w:type="dxa" w:w="30"/>
+              <w:left w:type="dxa" w:w="60"/>
+              <w:bottom w:type="dxa" w:w="30"/>
+              <w:right w:type="dxa" w:w="60"/>
+            </w:tcMar>
+          </w:tcPr>
+          <w:p>
+            <w:pPr>
+              <w:spacing w:after="0"/>
+            </w:pPr>
+            <w:r>
+              <w:rPr>
+                <w:b w:val="false"/>
+                <w:bCs w:val="false"/>
+                <w:sz w:val="14"/>
+                <w:szCs w:val="14"/>
+                <w:rFonts w:ascii="Arial" w:hAnsi="Arial" w:eastAsia="Malgun Gothic" w:cs="Arial"/>
+              </w:rPr>
+              <w:t xml:space="preserve">0.83x</w:t>
+            </w:r>
+          </w:p>
+        </w:tc>
+        <w:tc>
+          <w:tcPr>
+            <w:tcW w:type="dxa" w:w="4600"/>
+            <w:tcBorders>
+              <w:top w:val="single" w:color="BFBFBF" w:sz="4"/>
+              <w:left w:val="single" w:color="BFBFBF" w:sz="4"/>
+              <w:bottom w:val="single" w:color="BFBFBF" w:sz="4"/>
+              <w:right w:val="single" w:color="BFBFBF" w:sz="4"/>
+            </w:tcBorders>
+            <w:tcMar>
+              <w:top w:type="dxa" w:w="30"/>
+              <w:left w:type="dxa" w:w="60"/>
+              <w:bottom w:type="dxa" w:w="30"/>
+              <w:right w:type="dxa" w:w="60"/>
+            </w:tcMar>
+          </w:tcPr>
+          <w:p>
+            <w:pPr>
+              <w:spacing w:after="0"/>
+            </w:pPr>
+            <w:r>
+              <w:rPr>
+                <w:b w:val="false"/>
+                <w:bCs w:val="false"/>
+                <w:sz w:val="14"/>
+                <w:szCs w:val="14"/>
+                <w:rFonts w:ascii="Arial" w:hAnsi="Arial" w:eastAsia="Malgun Gothic" w:cs="Arial"/>
+              </w:rPr>
+              <w:t xml:space="preserve">원래 거래가 적어 변동 작음 — 저유동성이 구조적</w:t>
+            </w:r>
+          </w:p>
+        </w:tc>
+      </w:tr>
+      <w:tr>
+        <w:tc>
+          <w:tcPr>
+            <w:tcW w:type="dxa" w:w="2400"/>
+            <w:tcBorders>
+              <w:top w:val="single" w:color="BFBFBF" w:sz="4"/>
+              <w:left w:val="single" w:color="BFBFBF" w:sz="4"/>
+              <w:bottom w:val="single" w:color="BFBFBF" w:sz="4"/>
+              <w:right w:val="single" w:color="BFBFBF" w:sz="4"/>
+            </w:tcBorders>
+            <w:tcMar>
+              <w:top w:type="dxa" w:w="30"/>
+              <w:left w:type="dxa" w:w="60"/>
+              <w:bottom w:type="dxa" w:w="30"/>
+              <w:right w:type="dxa" w:w="60"/>
+            </w:tcMar>
+          </w:tcPr>
+          <w:p>
+            <w:pPr>
+              <w:spacing w:after="0"/>
+            </w:pPr>
+            <w:r>
+              <w:rPr>
+                <w:b w:val="false"/>
+                <w:bCs w:val="false"/>
+                <w:sz w:val="14"/>
+                <w:szCs w:val="14"/>
+                <w:rFonts w:ascii="Arial" w:hAnsi="Arial" w:eastAsia="Malgun Gothic" w:cs="Arial"/>
+              </w:rPr>
+              <w:t xml:space="preserve">B Mid-cap Alpha</w:t>
+            </w:r>
+          </w:p>
+        </w:tc>
+        <w:tc>
+          <w:tcPr>
+            <w:tcW w:type="dxa" w:w="2000"/>
+            <w:tcBorders>
+              <w:top w:val="single" w:color="BFBFBF" w:sz="4"/>
+              <w:left w:val="single" w:color="BFBFBF" w:sz="4"/>
+              <w:bottom w:val="single" w:color="BFBFBF" w:sz="4"/>
+              <w:right w:val="single" w:color="BFBFBF" w:sz="4"/>
+            </w:tcBorders>
+            <w:tcMar>
+              <w:top w:type="dxa" w:w="30"/>
+              <w:left w:type="dxa" w:w="60"/>
+              <w:bottom w:type="dxa" w:w="30"/>
+              <w:right w:type="dxa" w:w="60"/>
+            </w:tcMar>
+          </w:tcPr>
+          <w:p>
+            <w:pPr>
+              <w:spacing w:after="0"/>
+            </w:pPr>
+            <w:r>
+              <w:rPr>
+                <w:b w:val="false"/>
+                <w:bCs w:val="false"/>
+                <w:sz w:val="14"/>
+                <w:szCs w:val="14"/>
+                <w:rFonts w:ascii="Arial" w:hAnsi="Arial" w:eastAsia="Malgun Gothic" w:cs="Arial"/>
+              </w:rPr>
+              <w:t xml:space="preserve">0.41x</w:t>
+            </w:r>
+          </w:p>
+        </w:tc>
+        <w:tc>
+          <w:tcPr>
+            <w:tcW w:type="dxa" w:w="4600"/>
+            <w:tcBorders>
+              <w:top w:val="single" w:color="BFBFBF" w:sz="4"/>
+              <w:left w:val="single" w:color="BFBFBF" w:sz="4"/>
+              <w:bottom w:val="single" w:color="BFBFBF" w:sz="4"/>
+              <w:right w:val="single" w:color="BFBFBF" w:sz="4"/>
+            </w:tcBorders>
+            <w:tcMar>
+              <w:top w:type="dxa" w:w="30"/>
+              <w:left w:type="dxa" w:w="60"/>
+              <w:bottom w:type="dxa" w:w="30"/>
+              <w:right w:type="dxa" w:w="60"/>
+            </w:tcMar>
+          </w:tcPr>
+          <w:p>
+            <w:pPr>
+              <w:spacing w:after="0"/>
+            </w:pPr>
+            <w:r>
+              <w:rPr>
+                <w:b w:val="false"/>
+                <w:bCs w:val="false"/>
+                <w:sz w:val="14"/>
+                <w:szCs w:val="14"/>
+                <w:rFonts w:ascii="Arial" w:hAnsi="Arial" w:eastAsia="Malgun Gothic" w:cs="Arial"/>
+              </w:rPr>
+              <w:t xml:space="preserve">테마 수급 의존 → 저점에서 60% 감소. Event exit 계획 필수</w:t>
+            </w:r>
+          </w:p>
+        </w:tc>
+      </w:tr>
+    </w:tbl>
+    <w:p>
+      <w:pPr>
+        <w:pStyle w:val="ListParagraph"/>
+        <w:numPr>
+          <w:ilvl w:val="0"/>
+          <w:numId w:val="2"/>
+        </w:numPr>
+        <w:spacing w:after="40"/>
+      </w:pPr>
+      <w:r>
+        <w:rPr>
+          <w:b/>
+          <w:bCs/>
+          <w:sz w:val="19"/>
+          <w:szCs w:val="19"/>
+          <w:rFonts w:ascii="Arial" w:hAnsi="Arial" w:eastAsia="Malgun Gothic" w:cs="Arial"/>
+        </w:rPr>
+        <w:t xml:space="preserve">결론: </w:t>
+      </w:r>
+      <w:r>
+        <w:rPr>
+          <w:sz w:val="19"/>
+          <w:szCs w:val="19"/>
+          <w:rFonts w:ascii="Arial" w:hAnsi="Arial" w:eastAsia="Malgun Gothic" w:cs="Arial"/>
+        </w:rPr>
+        <w:t xml:space="preserve">Universe 시트 'Trough MaxPos %NAV' 열을 실질 사이징 상한으로 사용 권장. 현재 ADV 기준 6% OK 329종목 → 저점 ADV 기준 209종목(500억 Book).</w:t>
+      </w:r>
+    </w:p>
+    <w:p>
+      <w:pPr>
+        <w:pStyle w:val="Heading2"/>
+        <w:spacing w:before="160" w:after="60"/>
+      </w:pPr>
+      <w:r>
+        <w:rPr>
+          <w:b/>
+          <w:bCs/>
+          <w:color w:val="1F3864"/>
+          <w:sz w:val="21"/>
+          <w:szCs w:val="21"/>
+          <w:rFonts w:ascii="Arial" w:hAnsi="Arial" w:eastAsia="Malgun Gothic" w:cs="Arial"/>
+        </w:rPr>
+        <w:t xml:space="preserve">5-2. VaR 관점 — 편입비보다 먼저 걸리는 한도</w:t>
+      </w:r>
+    </w:p>
+    <w:p>
+      <w:pPr>
+        <w:pStyle w:val="ListParagraph"/>
+        <w:numPr>
+          <w:ilvl w:val="0"/>
+          <w:numId w:val="2"/>
+        </w:numPr>
+        <w:spacing w:after="40"/>
+      </w:pPr>
+      <w:r>
+        <w:rPr>
+          <w:b/>
+          <w:bCs/>
+          <w:sz w:val="19"/>
+          <w:szCs w:val="19"/>
+          <w:rFonts w:ascii="Arial" w:hAnsi="Arial" w:eastAsia="Malgun Gothic" w:cs="Arial"/>
+        </w:rPr>
+        <w:t xml:space="preserve">종목 VaR proxy: </w:t>
+      </w:r>
+      <w:r>
+        <w:rPr>
+          <w:sz w:val="19"/>
+          <w:szCs w:val="19"/>
+          <w:rFonts w:ascii="Arial" w:hAnsi="Arial" w:eastAsia="Malgun Gothic" w:cs="Arial"/>
+        </w:rPr>
+        <w:t xml:space="preserve">2.33 × 60D 일변동성. 유니버스 중위 12.5%, A1 12.8% (250D 기준 11.0%). 6% 단일 포지션 하나의 VaR 기여 = 0.7-0.8%p → -1% 한도의 3/4.</w:t>
+      </w:r>
+    </w:p>
+    <w:p>
+      <w:pPr>
+        <w:pStyle w:val="ListParagraph"/>
+        <w:numPr>
+          <w:ilvl w:val="0"/>
+          <w:numId w:val="2"/>
+        </w:numPr>
+        <w:spacing w:after="40"/>
+      </w:pPr>
+      <w:r>
+        <w:rPr>
+          <w:b/>
+          <w:bCs/>
+          <w:sz w:val="19"/>
+          <w:szCs w:val="19"/>
+          <w:rFonts w:ascii="Arial" w:hAnsi="Arial" w:eastAsia="Malgun Gothic" w:cs="Arial"/>
+        </w:rPr>
+        <w:t xml:space="preserve">샘플 포트(PreTrade_Check 시트, 20종목, pair 중심): </w:t>
+      </w:r>
+      <w:r>
+        <w:rPr>
+          <w:sz w:val="19"/>
+          <w:szCs w:val="19"/>
+          <w:rFonts w:ascii="Arial" w:hAnsi="Arial" w:eastAsia="Malgun Gothic" w:cs="Arial"/>
+        </w:rPr>
+        <w:t xml:space="preserve">Gross 60%, Net 18% (한도 6.0% → 선물 hedge 필요), TOP5 Long 25%. VaR proxy: 무상관 2.2% ~ 비분산 8.5%. 실제 pair 상관을 반영해도 -1% 한도를 맞추려면 Gross 25-35% 수준이거나 pair leg 상관이 0.8 이상이어야 함.</w:t>
+      </w:r>
+    </w:p>
+    <w:p>
+      <w:pPr>
+        <w:pStyle w:val="ListParagraph"/>
+        <w:numPr>
+          <w:ilvl w:val="0"/>
+          <w:numId w:val="2"/>
+        </w:numPr>
+        <w:spacing w:after="40"/>
+      </w:pPr>
+      <w:r>
+        <w:rPr>
+          <w:b/>
+          <w:bCs/>
+          <w:sz w:val="19"/>
+          <w:szCs w:val="19"/>
+          <w:rFonts w:ascii="Arial" w:hAnsi="Arial" w:eastAsia="Malgun Gothic" w:cs="Arial"/>
+        </w:rPr>
+        <w:t xml:space="preserve">시사점: </w:t>
+      </w:r>
+      <w:r>
+        <w:rPr>
+          <w:sz w:val="19"/>
+          <w:szCs w:val="19"/>
+          <w:rFonts w:ascii="Arial" w:hAnsi="Arial" w:eastAsia="Malgun Gothic" w:cs="Arial"/>
+        </w:rPr>
+        <w:t xml:space="preserve">BBAS Rule ②-1의 Target Vol 8% 보정(PM 3M Vol &lt; 8%면 VaR 한도 확대)이 실질적으로 유일한 완충. 초기 3개월은 pair·저베타 구조로 실현 vol을 8% 아래에 두는 것이 Gross 확보의 전제. 개별주 outright 포지션은 VaR 예산상 2-3% 이상 어렵다.</w:t>
+      </w:r>
+    </w:p>
+    <w:p>
+      <w:pPr>
+        <w:pStyle w:val="Heading2"/>
+        <w:spacing w:before="160" w:after="60"/>
+      </w:pPr>
+      <w:r>
+        <w:rPr>
+          <w:b/>
+          <w:bCs/>
+          <w:color w:val="1F3864"/>
+          <w:sz w:val="21"/>
+          <w:szCs w:val="21"/>
+          <w:rFonts w:ascii="Arial" w:hAnsi="Arial" w:eastAsia="Malgun Gothic" w:cs="Arial"/>
+        </w:rPr>
+        <w:t xml:space="preserve">5-3. PreTrade_Check 시트 사용법</w:t>
+      </w:r>
+    </w:p>
+    <w:p>
+      <w:pPr>
+        <w:pStyle w:val="ListParagraph"/>
+        <w:numPr>
+          <w:ilvl w:val="0"/>
+          <w:numId w:val="2"/>
+        </w:numPr>
+        <w:spacing w:after="40"/>
+      </w:pPr>
+      <w:r>
+        <w:rPr>
+          <w:sz w:val="19"/>
+          <w:szCs w:val="19"/>
+          <w:rFonts w:ascii="Arial" w:hAnsi="Arial" w:eastAsia="Malgun Gothic" w:cs="Arial"/>
+        </w:rPr>
+        <w:t xml:space="preserve">Code / Side / Weight / Event Play 승인 여부 입력 → 종목별 한도(6/8/10%, Short -4%), 3일 청산 가능 여부, 12M 저점 ADV 기준 DTL, Gross-cut(30%) 시 Day-1 매도액과 ADV 참여율 자동 계산.</w:t>
+      </w:r>
+    </w:p>
+    <w:p>
+      <w:pPr>
+        <w:pStyle w:val="ListParagraph"/>
+        <w:numPr>
+          <w:ilvl w:val="0"/>
+          <w:numId w:val="2"/>
+        </w:numPr>
+        <w:spacing w:after="40"/>
+      </w:pPr>
+      <w:r>
+        <w:rPr>
+          <w:sz w:val="19"/>
+          <w:szCs w:val="19"/>
+          <w:rFonts w:ascii="Arial" w:hAnsi="Arial" w:eastAsia="Malgun Gothic" w:cs="Arial"/>
+        </w:rPr>
+        <w:t xml:space="preserve">포트 레벨: Gross, Net vs Min(10%×Gross, 15%), Long/Short TOP5 ≤ 25%, 3천-7천억 합산 ≤ 7%, 3천억 미만 = 0, VaR proxy 2종 vs -1%. 위반 시 붉은색.</w:t>
       </w:r>
     </w:p>
     <w:p>
@@ -36166,6 +36941,24 @@
           <w:szCs w:val="19"/>
           <w:rFonts w:ascii="Arial" w:hAnsi="Arial" w:eastAsia="Malgun Gothic" w:cs="Arial"/>
         </w:rPr>
+        <w:t xml:space="preserve">PreTrade_Check 샘플 포트를 실제 MP로 교체 → Net 위반분(선물 hedge 규모)과 VaR 예산 대비 Gross 상한 산출.</w:t>
+      </w:r>
+    </w:p>
+    <w:p>
+      <w:pPr>
+        <w:pStyle w:val="ListParagraph"/>
+        <w:numPr>
+          <w:ilvl w:val="0"/>
+          <w:numId w:val="2"/>
+        </w:numPr>
+        <w:spacing w:after="40"/>
+      </w:pPr>
+      <w:r>
+        <w:rPr>
+          <w:sz w:val="19"/>
+          <w:szCs w:val="19"/>
+          <w:rFonts w:ascii="Arial" w:hAnsi="Arial" w:eastAsia="Malgun Gothic" w:cs="Arial"/>
+        </w:rPr>
         <w:t xml:space="preserve">데이터 갱신: build_universe.py → build_xlsx.py 재실행(일별 marcap 갱신 반영). 스크립트는 repo output/ 에 포함.</w:t>
       </w:r>
     </w:p>

</xml_diff>